<commit_message>
AI update 2026-05-02 10:13
</commit_message>
<xml_diff>
--- a/public/legal/sotsiaalai_tooalase_kasutuse_raamleping.docx
+++ b/public/legal/sotsiaalai_tooalase_kasutuse_raamleping.docx
@@ -13,7 +13,6 @@
           <w:szCs w:val="36"/>
         </w:rPr>
       </w:pPr>
-      <w:proofErr w:type="spellStart"/>
       <w:r>
         <w:rPr>
           <w:b/>
@@ -21,169 +20,21 @@
           <w:sz w:val="36"/>
           <w:szCs w:val="36"/>
         </w:rPr>
-        <w:t>SotsiaalAI</w:t>
-      </w:r>
-      <w:proofErr w:type="spellEnd"/>
-      <w:r>
-        <w:rPr>
-          <w:b/>
-          <w:bCs w:val="0"/>
-          <w:sz w:val="36"/>
-          <w:szCs w:val="36"/>
-        </w:rPr>
-        <w:t xml:space="preserve"> </w:t>
-      </w:r>
-      <w:proofErr w:type="spellStart"/>
-      <w:r>
-        <w:rPr>
-          <w:b/>
-          <w:bCs w:val="0"/>
-          <w:sz w:val="36"/>
-          <w:szCs w:val="36"/>
-        </w:rPr>
-        <w:t>tööalase</w:t>
-      </w:r>
-      <w:proofErr w:type="spellEnd"/>
-      <w:r>
-        <w:rPr>
-          <w:b/>
-          <w:bCs w:val="0"/>
-          <w:sz w:val="36"/>
-          <w:szCs w:val="36"/>
-        </w:rPr>
-        <w:t xml:space="preserve"> </w:t>
-      </w:r>
-      <w:proofErr w:type="spellStart"/>
-      <w:r>
-        <w:rPr>
-          <w:b/>
-          <w:bCs w:val="0"/>
-          <w:sz w:val="36"/>
-          <w:szCs w:val="36"/>
-        </w:rPr>
-        <w:t>kasutamise</w:t>
-      </w:r>
-      <w:proofErr w:type="spellEnd"/>
-      <w:r>
-        <w:rPr>
-          <w:b/>
-          <w:bCs w:val="0"/>
-          <w:sz w:val="36"/>
-          <w:szCs w:val="36"/>
-        </w:rPr>
-        <w:t xml:space="preserve"> ja </w:t>
-      </w:r>
-      <w:proofErr w:type="spellStart"/>
-      <w:r>
-        <w:rPr>
-          <w:b/>
-          <w:bCs w:val="0"/>
-          <w:sz w:val="36"/>
-          <w:szCs w:val="36"/>
-        </w:rPr>
-        <w:t>isikuandmete</w:t>
-      </w:r>
-      <w:proofErr w:type="spellEnd"/>
-      <w:r>
-        <w:rPr>
-          <w:b/>
-          <w:bCs w:val="0"/>
-          <w:sz w:val="36"/>
-          <w:szCs w:val="36"/>
-        </w:rPr>
-        <w:t xml:space="preserve"> </w:t>
-      </w:r>
-      <w:proofErr w:type="spellStart"/>
-      <w:r>
-        <w:rPr>
-          <w:b/>
-          <w:bCs w:val="0"/>
-          <w:sz w:val="36"/>
-          <w:szCs w:val="36"/>
-        </w:rPr>
-        <w:t>töötlemise</w:t>
-      </w:r>
-      <w:proofErr w:type="spellEnd"/>
-      <w:r>
-        <w:rPr>
-          <w:b/>
-          <w:bCs w:val="0"/>
-          <w:sz w:val="36"/>
-          <w:szCs w:val="36"/>
-        </w:rPr>
-        <w:t xml:space="preserve"> </w:t>
-      </w:r>
-      <w:proofErr w:type="spellStart"/>
-      <w:r>
-        <w:rPr>
-          <w:b/>
-          <w:bCs w:val="0"/>
-          <w:sz w:val="36"/>
-          <w:szCs w:val="36"/>
-        </w:rPr>
-        <w:t>raamleping</w:t>
-      </w:r>
-      <w:proofErr w:type="spellEnd"/>
+        <w:t>SotsiaalAI tööalase kasutamise ja isikuandmete töötlemise raamleping</w:t>
+      </w:r>
     </w:p>
     <w:p/>
     <w:p>
       <w:pPr>
         <w:pStyle w:val="Pealkiri1"/>
       </w:pPr>
-      <w:proofErr w:type="spellStart"/>
-      <w:r>
-        <w:t>Kasutajale</w:t>
-      </w:r>
-      <w:proofErr w:type="spellEnd"/>
-      <w:r>
-        <w:t xml:space="preserve"> ja </w:t>
-      </w:r>
-      <w:proofErr w:type="spellStart"/>
-      <w:r>
-        <w:t>organisatsioonile</w:t>
-      </w:r>
-      <w:proofErr w:type="spellEnd"/>
-      <w:r>
-        <w:t xml:space="preserve"> </w:t>
-      </w:r>
-      <w:proofErr w:type="spellStart"/>
-      <w:r>
-        <w:t>lühidalt</w:t>
-      </w:r>
-      <w:proofErr w:type="spellEnd"/>
-    </w:p>
-    <w:p>
-      <w:proofErr w:type="spellStart"/>
-      <w:r>
-        <w:t>SotsiaalAI</w:t>
-      </w:r>
-      <w:proofErr w:type="spellEnd"/>
-      <w:r>
-        <w:t xml:space="preserve"> </w:t>
-      </w:r>
-      <w:proofErr w:type="spellStart"/>
-      <w:r>
-        <w:t>platvormi</w:t>
-      </w:r>
-      <w:proofErr w:type="spellEnd"/>
-      <w:r>
-        <w:t xml:space="preserve"> </w:t>
-      </w:r>
-      <w:proofErr w:type="spellStart"/>
-      <w:r>
-        <w:t>tavapäraseks</w:t>
-      </w:r>
-      <w:proofErr w:type="spellEnd"/>
-      <w:r>
-        <w:t xml:space="preserve"> </w:t>
-      </w:r>
-      <w:proofErr w:type="spellStart"/>
-      <w:r>
-        <w:t>kasutamiseks</w:t>
-      </w:r>
-      <w:proofErr w:type="spellEnd"/>
-      <w:r>
-        <w:t xml:space="preserve"> ei ole eraldi raamlepingut vaja. Käesolev raamleping on mõeldud olukorraks, kus organisatsioon või kohalik omavalitsus soovib lubada SotsiaalAI kasutamist tööülesannetes, mille käigus võib esineda isikuandmete töötlemist.</w:t>
+      <w:r>
+        <w:t>Kasutajale ja organisatsioonile lühidalt</w:t>
+      </w:r>
+    </w:p>
+    <w:p>
+      <w:r>
+        <w:t>SotsiaalAI platvormi tavapäraseks kasutamiseks ei ole eraldi raamlepingut vaja. Käesolev raamleping on mõeldud olukorraks, kus organisatsioon või kohalik omavalitsus soovib lubada SotsiaalAI kasutamist tööülesannetes, mille käigus võib esineda isikuandmete töötlemist.</w:t>
       </w:r>
     </w:p>
     <w:p>
@@ -848,39 +699,7 @@
     </w:p>
     <w:p>
       <w:r>
-        <w:t xml:space="preserve">16.2. Lepingu lisad moodustavad lepingu lahutamatu osa, kui pooled ei </w:t>
-      </w:r>
-      <w:proofErr w:type="spellStart"/>
-      <w:r>
-        <w:t>lepi</w:t>
-      </w:r>
-      <w:proofErr w:type="spellEnd"/>
-      <w:r>
-        <w:t xml:space="preserve"> </w:t>
-      </w:r>
-      <w:proofErr w:type="spellStart"/>
-      <w:r>
-        <w:t>kirjalikult</w:t>
-      </w:r>
-      <w:proofErr w:type="spellEnd"/>
-      <w:r>
-        <w:t xml:space="preserve"> </w:t>
-      </w:r>
-      <w:proofErr w:type="spellStart"/>
-      <w:r>
-        <w:t>kokku</w:t>
-      </w:r>
-      <w:proofErr w:type="spellEnd"/>
-      <w:r>
-        <w:t xml:space="preserve"> </w:t>
-      </w:r>
-      <w:proofErr w:type="spellStart"/>
-      <w:r>
-        <w:t>teisiti</w:t>
-      </w:r>
-      <w:proofErr w:type="spellEnd"/>
-      <w:r>
-        <w:t>.</w:t>
+        <w:t>16.2. Lepingu lisad moodustavad lepingu lahutamatu osa, kui pooled ei lepi kirjalikult kokku teisiti.</w:t>
       </w:r>
     </w:p>
     <w:p>
@@ -925,7 +744,6 @@
                 <w:szCs w:val="24"/>
               </w:rPr>
             </w:pPr>
-            <w:proofErr w:type="spellStart"/>
             <w:r>
               <w:rPr>
                 <w:b/>
@@ -934,7 +752,6 @@
               </w:rPr>
               <w:t>Organisatsioon</w:t>
             </w:r>
-            <w:proofErr w:type="spellEnd"/>
           </w:p>
           <w:p>
             <w:pPr>
@@ -957,21 +774,12 @@
                 <w:szCs w:val="24"/>
               </w:rPr>
             </w:pPr>
-            <w:proofErr w:type="spellStart"/>
             <w:r>
               <w:rPr>
                 <w:b/>
                 <w:szCs w:val="24"/>
               </w:rPr>
-              <w:t>Registrikood</w:t>
-            </w:r>
-            <w:proofErr w:type="spellEnd"/>
-            <w:r>
-              <w:rPr>
-                <w:b/>
-                <w:szCs w:val="24"/>
-              </w:rPr>
-              <w:t>:</w:t>
+              <w:t>Registrikood:</w:t>
             </w:r>
           </w:p>
           <w:p>
@@ -1031,7 +839,6 @@
                 <w:szCs w:val="24"/>
               </w:rPr>
             </w:pPr>
-            <w:proofErr w:type="spellStart"/>
             <w:r>
               <w:rPr>
                 <w:bCs/>
@@ -1040,7 +847,6 @@
               </w:rPr>
               <w:t>SotsiaalAI</w:t>
             </w:r>
-            <w:proofErr w:type="spellEnd"/>
           </w:p>
           <w:p>
             <w:pPr>
@@ -1052,21 +858,12 @@
                 <w:szCs w:val="24"/>
               </w:rPr>
             </w:pPr>
-            <w:proofErr w:type="spellStart"/>
             <w:r>
               <w:rPr>
                 <w:bCs/>
                 <w:szCs w:val="24"/>
               </w:rPr>
-              <w:t>SotsiaalAI</w:t>
-            </w:r>
-            <w:proofErr w:type="spellEnd"/>
-            <w:r>
-              <w:rPr>
-                <w:bCs/>
-                <w:szCs w:val="24"/>
-              </w:rPr>
-              <w:t xml:space="preserve"> OÜ</w:t>
+              <w:t>SotsiaalAI OÜ</w:t>
             </w:r>
           </w:p>
           <w:p>
@@ -1098,30 +895,8 @@
               <w:rPr>
                 <w:szCs w:val="24"/>
               </w:rPr>
-              <w:t xml:space="preserve">Laur Raudsoo, </w:t>
+              <w:t>Laur Raudsoo, juhatuse liige</w:t>
             </w:r>
-            <w:proofErr w:type="spellStart"/>
-            <w:r>
-              <w:rPr>
-                <w:szCs w:val="24"/>
-              </w:rPr>
-              <w:t>juhatuse</w:t>
-            </w:r>
-            <w:proofErr w:type="spellEnd"/>
-            <w:r>
-              <w:rPr>
-                <w:szCs w:val="24"/>
-              </w:rPr>
-              <w:t xml:space="preserve"> </w:t>
-            </w:r>
-            <w:proofErr w:type="spellStart"/>
-            <w:r>
-              <w:rPr>
-                <w:szCs w:val="24"/>
-              </w:rPr>
-              <w:t>liige</w:t>
-            </w:r>
-            <w:proofErr w:type="spellEnd"/>
           </w:p>
           <w:p>
             <w:pPr>
@@ -1164,14 +939,12 @@
                 <w:szCs w:val="24"/>
               </w:rPr>
             </w:pPr>
-            <w:proofErr w:type="spellStart"/>
             <w:r>
               <w:rPr>
                 <w:szCs w:val="24"/>
               </w:rPr>
               <w:t>digitaalne</w:t>
             </w:r>
-            <w:proofErr w:type="spellEnd"/>
           </w:p>
         </w:tc>
       </w:tr>
@@ -2556,7 +2329,7 @@
               <w:rPr>
                 <w:sz w:val="22"/>
               </w:rPr>
-              <w:t>Kõnesüntees, kui vastav funktsioon on kasutusel.</w:t>
+              <w:t>Kõnesüntees.</w:t>
             </w:r>
           </w:p>
         </w:tc>
@@ -2678,7 +2451,7 @@
                 <w:sz w:val="22"/>
               </w:rPr>
               <w:lastRenderedPageBreak/>
-              <w:t>Redis või muu sõnumivahenduse teenus</w:t>
+              <w:t>Redis</w:t>
             </w:r>
           </w:p>
         </w:tc>
@@ -2698,7 +2471,7 @@
               <w:rPr>
                 <w:sz w:val="22"/>
               </w:rPr>
-              <w:t>Ruumide, reaalajas sündmuste või tehniliste töövoogude käitamine, kui kasutusel.</w:t>
+              <w:t>Ruumide, reaalajas sündmuste ja tehniliste töövoogude käitamine.</w:t>
             </w:r>
           </w:p>
         </w:tc>
@@ -2792,7 +2565,7 @@
               <w:rPr>
                 <w:sz w:val="22"/>
               </w:rPr>
-              <w:t>Asukohaotsing ja asukohapõhise info täpsustamine assistendi vestluses, abisoovide ja abipakkumiste töövoos ning muudes platvormi funktsioonides, kui vastav funktsioon on kasutusel.</w:t>
+              <w:t>Asukohaotsing ja asukohapõhise info täpsustamine assistendi vestluses, abisoovide ja abipakkumiste töövoos ning muudes platvormi funktsioonides.</w:t>
             </w:r>
           </w:p>
         </w:tc>
@@ -2839,7 +2612,7 @@
               <w:rPr>
                 <w:sz w:val="22"/>
               </w:rPr>
-              <w:t>Platvormi majutus ja serveritaristu, kui see on konkreetse keskkonna teenusepakkuja.</w:t>
+              <w:t>Platvormi majutus ja serveritaristu.</w:t>
             </w:r>
           </w:p>
         </w:tc>
@@ -4412,6 +4185,7 @@
   <w:style w:type="character" w:default="1" w:styleId="Liguvaikefont">
     <w:name w:val="Default Paragraph Font"/>
     <w:uiPriority w:val="1"/>
+    <w:semiHidden/>
     <w:unhideWhenUsed/>
   </w:style>
   <w:style w:type="table" w:default="1" w:styleId="Normaaltabel">

</xml_diff>